<commit_message>
feat: Add device brand to rental client manual
Co-authored-by: chentianran <chentianran@shengdaxun.com>
</commit_message>
<xml_diff>
--- a/third_party_test_report/租赁设备客户端发布手册.docx
+++ b/third_party_test_report/租赁设备客户端发布手册.docx
@@ -157,6 +157,28 @@
           <w:p>
             <w:r>
               <w:t>亿思维科技有限公司</w:t>
+            </w:r>
+          </w:p>
+        </w:tc>
+      </w:tr>
+      <w:tr>
+        <w:tc>
+          <w:tcPr>
+            <w:tcW w:type="dxa" w:w="4320"/>
+          </w:tcPr>
+          <w:p>
+            <w:r>
+              <w:t>设备品牌</w:t>
+            </w:r>
+          </w:p>
+        </w:tc>
+        <w:tc>
+          <w:tcPr>
+            <w:tcW w:type="dxa" w:w="4320"/>
+          </w:tcPr>
+          <w:p>
+            <w:r>
+              <w:t>Sunmi (商米)</w:t>
             </w:r>
           </w:p>
         </w:tc>
@@ -337,6 +359,17 @@
       </w:pPr>
       <w:r>
         <w:t>2.1 设备信息</w:t>
+      </w:r>
+    </w:p>
+    <w:p>
+      <w:r>
+        <w:rPr>
+          <w:b/>
+        </w:rPr>
+        <w:t xml:space="preserve">设备品牌: </w:t>
+      </w:r>
+      <w:r>
+        <w:t>Sunmi (商米)</w:t>
       </w:r>
     </w:p>
     <w:p>

</xml_diff>